<commit_message>
Publica template Litoral Norte por Pedro
</commit_message>
<xml_diff>
--- a/templates/litoral_norte.docx
+++ b/templates/litoral_norte.docx
@@ -24,7 +24,6 @@
       <w:r>
         <w:rPr>
           <w:rFonts w:ascii="Arial" w:hAnsi="Arial" w:eastAsia="Arial" w:cs="Arial"/>
-          <w:b w:val="0"/>
           <w:sz w:val="20"/>
         </w:rPr>
         <w:t>À</w:t>
@@ -38,7 +37,6 @@
       <w:r>
         <w:rPr>
           <w:rFonts w:ascii="Arial" w:hAnsi="Arial" w:eastAsia="Arial" w:cs="Arial"/>
-          <w:b w:val="0"/>
           <w:sz w:val="20"/>
         </w:rPr>
         <w:t>SINDICATO DOS EMPREGADOS NO COMERCIO HOTELEIRO E SIMILARES DE APARECIDA -SECHSAR (a/c.: Luís Carlos/Geisla)</w:t>
@@ -52,7 +50,6 @@
       <w:r>
         <w:rPr>
           <w:rFonts w:ascii="Arial" w:hAnsi="Arial" w:eastAsia="Arial" w:cs="Arial"/>
-          <w:b w:val="0"/>
           <w:sz w:val="20"/>
         </w:rPr>
         <w:t>E</w:t>
@@ -66,18 +63,10 @@
       <w:r>
         <w:rPr>
           <w:rFonts w:ascii="Arial" w:hAnsi="Arial" w:eastAsia="Arial" w:cs="Arial"/>
-          <w:b w:val="0"/>
           <w:sz w:val="20"/>
         </w:rPr>
-        <w:t>SINDICATO DE HOTÉIS, RESTAURANTES, BARES E UBATUBA - SINHORES (a/c.:Fernanda)</w:t>
+        <w:t>SINDICATO DE HOTÉIS, RESTAURANTES, BARES E UBATUBA - SINHORES (a/c.: Mariana)</w:t>
       </w:r>
-    </w:p>
-    <w:p>
-      <w:pPr>
-        <w:spacing w:before="0" w:after="0" w:line="240" w:lineRule="auto"/>
-        <w:jc w:val="both"/>
-      </w:pPr>
-      <w:r/>
     </w:p>
     <w:p>
       <w:pPr>
@@ -87,42 +76,8 @@
       <w:r>
         <w:rPr>
           <w:rFonts w:ascii="Arial" w:hAnsi="Arial" w:eastAsia="Arial" w:cs="Arial"/>
-          <w:b w:val="0"/>
           <w:sz w:val="20"/>
         </w:rPr>
-        <w:t xml:space="preserve">Declaramos que a empresa </w:t>
-      </w:r>
-      <w:r>
-        <w:rPr>
-          <w:rFonts w:ascii="Arial" w:hAnsi="Arial" w:eastAsia="Arial" w:cs="Arial"/>
-          <w:b/>
-          <w:sz w:val="20"/>
-        </w:rPr>
-        <w:t>{{EMPRESA}} - {{CNPJ}}</w:t>
-      </w:r>
-      <w:r>
-        <w:rPr>
-          <w:rFonts w:ascii="Arial" w:hAnsi="Arial" w:eastAsia="Arial" w:cs="Arial"/>
-          <w:b w:val="0"/>
-          <w:sz w:val="20"/>
-        </w:rPr>
-        <w:t xml:space="preserve">, está de acordo com a ATUALIZAÇÃO da CCT do Litoral Norte e Região, tendo contrato o </w:t>
-      </w:r>
-      <w:r>
-        <w:rPr>
-          <w:rFonts w:ascii="Arial" w:hAnsi="Arial" w:eastAsia="Arial" w:cs="Arial"/>
-          <w:b/>
-          <w:sz w:val="20"/>
-        </w:rPr>
-        <w:t>{{BLOCO_BENEFICIOS}}</w:t>
-      </w:r>
-      <w:r>
-        <w:rPr>
-          <w:rFonts w:ascii="Arial" w:hAnsi="Arial" w:eastAsia="Arial" w:cs="Arial"/>
-          <w:b w:val="0"/>
-          <w:sz w:val="20"/>
-        </w:rPr>
-        <w:t xml:space="preserve"> os quais atendem na íntegra a CLÁUSULA CESTA DE BENEFÍCIOS.</w:t>
       </w:r>
     </w:p>
     <w:p>
@@ -130,7 +85,9 @@
         <w:spacing w:before="0" w:after="0" w:line="240" w:lineRule="auto"/>
         <w:jc w:val="both"/>
       </w:pPr>
-      <w:r/>
+      <w:r>
+        <w:t>Declaramos que a empresa {{EMPRESA}} - {{CNPJ}}, está de acordo com a ATUALIZAÇÃO da CCT do Litoral Norte e Região, tendo contrato o {{BLOCO_BENEFICIOS}} os quais atendem na íntegra a CLÁUSULA CESTA DE BENEFÍCIOS.</w:t>
+      </w:r>
     </w:p>
     <w:p>
       <w:pPr>
@@ -140,7 +97,18 @@
       <w:r>
         <w:rPr>
           <w:rFonts w:ascii="Arial" w:hAnsi="Arial" w:eastAsia="Arial" w:cs="Arial"/>
-          <w:b w:val="0"/>
+          <w:sz w:val="20"/>
+        </w:rPr>
+      </w:r>
+    </w:p>
+    <w:p>
+      <w:pPr>
+        <w:spacing w:before="0" w:after="0" w:line="240" w:lineRule="auto"/>
+        <w:jc w:val="both"/>
+      </w:pPr>
+      <w:r>
+        <w:rPr>
+          <w:rFonts w:ascii="Arial" w:hAnsi="Arial" w:eastAsia="Arial" w:cs="Arial"/>
           <w:sz w:val="20"/>
         </w:rPr>
         <w:t>A ATUALIZAÇÃO da apólice foi formalizada mediante o pagamento do boleto pago em {{PAGTO}}.</w:t>
@@ -151,17 +119,9 @@
         <w:spacing w:before="0" w:after="0" w:line="240" w:lineRule="auto"/>
         <w:jc w:val="both"/>
       </w:pPr>
-      <w:r/>
-    </w:p>
-    <w:p>
-      <w:pPr>
-        <w:spacing w:before="0" w:after="0" w:line="240" w:lineRule="auto"/>
-        <w:jc w:val="both"/>
-      </w:pPr>
       <w:r>
         <w:rPr>
           <w:rFonts w:ascii="Arial" w:hAnsi="Arial" w:eastAsia="Arial" w:cs="Arial"/>
-          <w:b w:val="0"/>
           <w:sz w:val="20"/>
         </w:rPr>
         <w:t>Informamos que a nova apólice do Seguro de Vida com Telemedicina por vídeo chamada, assim como o Resumo de Fatura do Plano Odontológico e as respectivas carteirinhas estão, atualmente, em processo de emissão junto à Seguradora. Tão logo estejam disponíveis, serão prontamente encaminhados ao e-mail do nosso estimado cliente.</w:t>
@@ -175,7 +135,18 @@
       <w:r>
         <w:rPr>
           <w:rFonts w:ascii="Arial" w:hAnsi="Arial" w:eastAsia="Arial" w:cs="Arial"/>
-          <w:b w:val="0"/>
+          <w:sz w:val="20"/>
+        </w:rPr>
+      </w:r>
+    </w:p>
+    <w:p>
+      <w:pPr>
+        <w:spacing w:before="0" w:after="0" w:line="240" w:lineRule="auto"/>
+        <w:jc w:val="both"/>
+      </w:pPr>
+      <w:r>
+        <w:rPr>
+          <w:rFonts w:ascii="Arial" w:hAnsi="Arial" w:eastAsia="Arial" w:cs="Arial"/>
           <w:sz w:val="20"/>
         </w:rPr>
         <w:t>A Cesta de Benefícios está ativa para os colaboradores abaixo:</w:t>
@@ -186,17 +157,9 @@
         <w:spacing w:before="0" w:after="0" w:line="240" w:lineRule="auto"/>
         <w:jc w:val="both"/>
       </w:pPr>
-      <w:r/>
-    </w:p>
-    <w:p>
-      <w:pPr>
-        <w:spacing w:before="0" w:after="0" w:line="240" w:lineRule="auto"/>
-        <w:jc w:val="both"/>
-      </w:pPr>
       <w:r>
         <w:rPr>
           <w:rFonts w:ascii="Arial" w:hAnsi="Arial" w:eastAsia="Arial" w:cs="Arial"/>
-          <w:b w:val="0"/>
           <w:sz w:val="20"/>
         </w:rPr>
         <w:t>{{LISTA_ATIVOS}}</w:t>
@@ -210,7 +173,6 @@
       <w:r>
         <w:rPr>
           <w:rFonts w:ascii="Arial" w:hAnsi="Arial" w:eastAsia="Arial" w:cs="Arial"/>
-          <w:b w:val="0"/>
           <w:sz w:val="20"/>
         </w:rPr>
         <w:t>São Paulo, {{DATA_HOJE}}</w:t>
@@ -224,7 +186,6 @@
       <w:r>
         <w:rPr>
           <w:rFonts w:ascii="Arial" w:hAnsi="Arial" w:eastAsia="Arial" w:cs="Arial"/>
-          <w:b w:val="0"/>
           <w:sz w:val="20"/>
         </w:rPr>
         <w:t>{{ASSINATURA}}</w:t>

</xml_diff>

<commit_message>
Publica template 10008 - LITORAL NORTE por Marcos
</commit_message>
<xml_diff>
--- a/templates/litoral_norte.docx
+++ b/templates/litoral_norte.docx
@@ -24,6 +24,7 @@
       <w:r>
         <w:rPr>
           <w:rFonts w:ascii="Arial" w:hAnsi="Arial" w:eastAsia="Arial" w:cs="Arial"/>
+          <w:b w:val="0"/>
           <w:sz w:val="20"/>
         </w:rPr>
         <w:t>À</w:t>
@@ -37,6 +38,7 @@
       <w:r>
         <w:rPr>
           <w:rFonts w:ascii="Arial" w:hAnsi="Arial" w:eastAsia="Arial" w:cs="Arial"/>
+          <w:b w:val="0"/>
           <w:sz w:val="20"/>
         </w:rPr>
         <w:t>SINDICATO DOS EMPREGADOS NO COMERCIO HOTELEIRO E SIMILARES DE APARECIDA -SECHSAR (a/c.: Luís Carlos/Geisla)</w:t>
@@ -50,6 +52,7 @@
       <w:r>
         <w:rPr>
           <w:rFonts w:ascii="Arial" w:hAnsi="Arial" w:eastAsia="Arial" w:cs="Arial"/>
+          <w:b w:val="0"/>
           <w:sz w:val="20"/>
         </w:rPr>
         <w:t>E</w:t>
@@ -63,10 +66,18 @@
       <w:r>
         <w:rPr>
           <w:rFonts w:ascii="Arial" w:hAnsi="Arial" w:eastAsia="Arial" w:cs="Arial"/>
+          <w:b w:val="0"/>
           <w:sz w:val="20"/>
         </w:rPr>
-        <w:t>SINDICATO DE HOTÉIS, RESTAURANTES, BARES E UBATUBA - SINHORES (a/c.: Mariana)</w:t>
+        <w:t>SINDICATO DE HOTÉIS, RESTAURANTES, BARES E UBATUBA - SINHORES (a/c.:Fernanda)</w:t>
       </w:r>
+    </w:p>
+    <w:p>
+      <w:pPr>
+        <w:spacing w:before="0" w:after="0" w:line="240" w:lineRule="auto"/>
+        <w:jc w:val="both"/>
+      </w:pPr>
+      <w:r/>
     </w:p>
     <w:p>
       <w:pPr>
@@ -76,8 +87,42 @@
       <w:r>
         <w:rPr>
           <w:rFonts w:ascii="Arial" w:hAnsi="Arial" w:eastAsia="Arial" w:cs="Arial"/>
+          <w:b w:val="0"/>
           <w:sz w:val="20"/>
         </w:rPr>
+        <w:t xml:space="preserve">Declaramos que a empresa </w:t>
+      </w:r>
+      <w:r>
+        <w:rPr>
+          <w:rFonts w:ascii="Arial" w:hAnsi="Arial" w:eastAsia="Arial" w:cs="Arial"/>
+          <w:b/>
+          <w:sz w:val="20"/>
+        </w:rPr>
+        <w:t>{{EMPRESA}} - {{CNPJ}}</w:t>
+      </w:r>
+      <w:r>
+        <w:rPr>
+          <w:rFonts w:ascii="Arial" w:hAnsi="Arial" w:eastAsia="Arial" w:cs="Arial"/>
+          <w:b w:val="0"/>
+          <w:sz w:val="20"/>
+        </w:rPr>
+        <w:t xml:space="preserve">, está de acordo com a ATUALIZAÇÃO da CCT do Litoral Norte e Região, tendo contrato o </w:t>
+      </w:r>
+      <w:r>
+        <w:rPr>
+          <w:rFonts w:ascii="Arial" w:hAnsi="Arial" w:eastAsia="Arial" w:cs="Arial"/>
+          <w:b/>
+          <w:sz w:val="20"/>
+        </w:rPr>
+        <w:t>{{BLOCO_BENEFICIOS}}</w:t>
+      </w:r>
+      <w:r>
+        <w:rPr>
+          <w:rFonts w:ascii="Arial" w:hAnsi="Arial" w:eastAsia="Arial" w:cs="Arial"/>
+          <w:b w:val="0"/>
+          <w:sz w:val="20"/>
+        </w:rPr>
+        <w:t xml:space="preserve"> os quais atendem na íntegra a CLÁUSULA CESTA DE BENEFÍCIOS.</w:t>
       </w:r>
     </w:p>
     <w:p>
@@ -85,9 +130,7 @@
         <w:spacing w:before="0" w:after="0" w:line="240" w:lineRule="auto"/>
         <w:jc w:val="both"/>
       </w:pPr>
-      <w:r>
-        <w:t>Declaramos que a empresa {{EMPRESA}} - {{CNPJ}}, está de acordo com a ATUALIZAÇÃO da CCT do Litoral Norte e Região, tendo contrato o {{BLOCO_BENEFICIOS}} os quais atendem na íntegra a CLÁUSULA CESTA DE BENEFÍCIOS.</w:t>
-      </w:r>
+      <w:r/>
     </w:p>
     <w:p>
       <w:pPr>
@@ -97,18 +140,7 @@
       <w:r>
         <w:rPr>
           <w:rFonts w:ascii="Arial" w:hAnsi="Arial" w:eastAsia="Arial" w:cs="Arial"/>
-          <w:sz w:val="20"/>
-        </w:rPr>
-      </w:r>
-    </w:p>
-    <w:p>
-      <w:pPr>
-        <w:spacing w:before="0" w:after="0" w:line="240" w:lineRule="auto"/>
-        <w:jc w:val="both"/>
-      </w:pPr>
-      <w:r>
-        <w:rPr>
-          <w:rFonts w:ascii="Arial" w:hAnsi="Arial" w:eastAsia="Arial" w:cs="Arial"/>
+          <w:b w:val="0"/>
           <w:sz w:val="20"/>
         </w:rPr>
         <w:t>A ATUALIZAÇÃO da apólice foi formalizada mediante o pagamento do boleto pago em {{PAGTO}}.</w:t>
@@ -119,9 +151,17 @@
         <w:spacing w:before="0" w:after="0" w:line="240" w:lineRule="auto"/>
         <w:jc w:val="both"/>
       </w:pPr>
+      <w:r/>
+    </w:p>
+    <w:p>
+      <w:pPr>
+        <w:spacing w:before="0" w:after="0" w:line="240" w:lineRule="auto"/>
+        <w:jc w:val="both"/>
+      </w:pPr>
       <w:r>
         <w:rPr>
           <w:rFonts w:ascii="Arial" w:hAnsi="Arial" w:eastAsia="Arial" w:cs="Arial"/>
+          <w:b w:val="0"/>
           <w:sz w:val="20"/>
         </w:rPr>
         <w:t>Informamos que a nova apólice do Seguro de Vida com Telemedicina por vídeo chamada, assim como o Resumo de Fatura do Plano Odontológico e as respectivas carteirinhas estão, atualmente, em processo de emissão junto à Seguradora. Tão logo estejam disponíveis, serão prontamente encaminhados ao e-mail do nosso estimado cliente.</w:t>
@@ -135,18 +175,7 @@
       <w:r>
         <w:rPr>
           <w:rFonts w:ascii="Arial" w:hAnsi="Arial" w:eastAsia="Arial" w:cs="Arial"/>
-          <w:sz w:val="20"/>
-        </w:rPr>
-      </w:r>
-    </w:p>
-    <w:p>
-      <w:pPr>
-        <w:spacing w:before="0" w:after="0" w:line="240" w:lineRule="auto"/>
-        <w:jc w:val="both"/>
-      </w:pPr>
-      <w:r>
-        <w:rPr>
-          <w:rFonts w:ascii="Arial" w:hAnsi="Arial" w:eastAsia="Arial" w:cs="Arial"/>
+          <w:b w:val="0"/>
           <w:sz w:val="20"/>
         </w:rPr>
         <w:t>A Cesta de Benefícios está ativa para os colaboradores abaixo:</w:t>
@@ -157,9 +186,17 @@
         <w:spacing w:before="0" w:after="0" w:line="240" w:lineRule="auto"/>
         <w:jc w:val="both"/>
       </w:pPr>
+      <w:r/>
+    </w:p>
+    <w:p>
+      <w:pPr>
+        <w:spacing w:before="0" w:after="0" w:line="240" w:lineRule="auto"/>
+        <w:jc w:val="both"/>
+      </w:pPr>
       <w:r>
         <w:rPr>
           <w:rFonts w:ascii="Arial" w:hAnsi="Arial" w:eastAsia="Arial" w:cs="Arial"/>
+          <w:b w:val="0"/>
           <w:sz w:val="20"/>
         </w:rPr>
         <w:t>{{LISTA_ATIVOS}}</w:t>
@@ -173,6 +210,7 @@
       <w:r>
         <w:rPr>
           <w:rFonts w:ascii="Arial" w:hAnsi="Arial" w:eastAsia="Arial" w:cs="Arial"/>
+          <w:b w:val="0"/>
           <w:sz w:val="20"/>
         </w:rPr>
         <w:t>São Paulo, {{DATA_HOJE}}</w:t>
@@ -186,6 +224,7 @@
       <w:r>
         <w:rPr>
           <w:rFonts w:ascii="Arial" w:hAnsi="Arial" w:eastAsia="Arial" w:cs="Arial"/>
+          <w:b w:val="0"/>
           <w:sz w:val="20"/>
         </w:rPr>
         <w:t>{{ASSINATURA}}</w:t>

</xml_diff>